<commit_message>
feat: complete Personal Information sheet coverage — emergency contact fields
The school's Personal Information sheet is now generated 100% from
intern-entered data: a new 'In case of an emergency' section on the
Personal Info page (name, relationship, address, contact) with service-side
fallbacks to the guardian/parents details, dedicated variables in the
rebuilt macroized starter (rebuilt cleanly from the official blank form),
an emergency row on the admin intern profile, and a hint card on the
account profile pointing interns to Personal Info. 330 tests passing.
</commit_message>
<xml_diff>
--- a/public/documents/Student Intern's Personal Information Template.docx
+++ b/public/documents/Student Intern's Personal Information Template.docx
@@ -307,16 +307,7 @@
                 <w:sz w:val="20"/>
                 <w:szCs w:val="20"/>
               </w:rPr>
-              <w:t xml:space="preserve"> </w:t>
-            </w:r>
-            <w:r>
-              <w:rPr>
-                <w:rFonts w:ascii="Arial" w:hAnsi="Arial" w:cs="Arial"/>
-                <w:color w:val="FF0000"/>
-                <w:sz w:val="20"/>
-                <w:szCs w:val="20"/>
-              </w:rPr>
-              <w:t>${last_name}</w:t>
+              <w:t xml:space="preserve">${last_name}</w:t>
             </w:r>
           </w:p>
         </w:tc>
@@ -356,53 +347,43 @@
                 <w:sz w:val="20"/>
                 <w:szCs w:val="20"/>
               </w:rPr>
+              <w:t xml:space="preserve">${first_name}</w:t>
+            </w:r>
+          </w:p>
+        </w:tc>
+        <w:tc>
+          <w:tcPr>
+            <w:tcW w:w="3204" w:type="dxa"/>
+          </w:tcPr>
+          <w:p>
+            <w:pPr>
+              <w:spacing w:line="360" w:lineRule="auto"/>
+              <w:rPr>
+                <w:rFonts w:ascii="Arial" w:hAnsi="Arial" w:cs="Arial"/>
+                <w:sz w:val="20"/>
+                <w:szCs w:val="20"/>
+              </w:rPr>
+            </w:pPr>
+            <w:r>
+              <w:rPr>
+                <w:rFonts w:ascii="Arial" w:hAnsi="Arial" w:cs="Arial"/>
+                <w:sz w:val="20"/>
+                <w:szCs w:val="20"/>
+              </w:rPr>
+              <w:t>Middle Name:</w:t>
+            </w:r>
+            <w:r>
+              <w:rPr>
+                <w:rFonts w:ascii="Arial" w:hAnsi="Arial" w:cs="Arial"/>
+                <w:sz w:val="20"/>
+                <w:szCs w:val="20"/>
+              </w:rPr>
               <w:t xml:space="preserve"> </w:t>
             </w:r>
-            <w:r>
-              <w:rPr>
-                <w:rFonts w:ascii="Arial" w:hAnsi="Arial" w:cs="Arial"/>
-                <w:color w:val="FF0000"/>
-                <w:sz w:val="20"/>
-                <w:szCs w:val="20"/>
-              </w:rPr>
-              <w:t>${first_name}</w:t>
-            </w:r>
-          </w:p>
-        </w:tc>
-        <w:tc>
-          <w:tcPr>
-            <w:tcW w:w="3204" w:type="dxa"/>
-          </w:tcPr>
-          <w:p>
-            <w:pPr>
-              <w:spacing w:line="360" w:lineRule="auto"/>
-              <w:rPr>
-                <w:rFonts w:ascii="Arial" w:hAnsi="Arial" w:cs="Arial"/>
-                <w:sz w:val="20"/>
-                <w:szCs w:val="20"/>
-              </w:rPr>
-            </w:pPr>
-            <w:r>
-              <w:rPr>
-                <w:rFonts w:ascii="Arial" w:hAnsi="Arial" w:cs="Arial"/>
-                <w:sz w:val="20"/>
-                <w:szCs w:val="20"/>
-              </w:rPr>
-              <w:t>Middle Name:</w:t>
-            </w:r>
-            <w:r>
-              <w:rPr>
-                <w:rFonts w:ascii="Arial" w:hAnsi="Arial" w:cs="Arial"/>
-                <w:sz w:val="20"/>
-                <w:szCs w:val="20"/>
-              </w:rPr>
-              <w:t xml:space="preserve"> </w:t>
-            </w:r>
             <w:proofErr w:type="spellStart"/>
             <w:r>
               <w:rPr>
                 <w:rFonts w:ascii="Arial" w:hAnsi="Arial" w:cs="Arial"/>
-                <w:color w:val="FF0000"/>
                 <w:sz w:val="20"/>
                 <w:szCs w:val="20"/>
               </w:rPr>
@@ -445,15 +426,6 @@
               </w:rPr>
               <w:t xml:space="preserve"/>
             </w:r>
-            <w:r>
-              <w:rPr>
-                <w:rFonts w:ascii="Arial" w:hAnsi="Arial" w:cs="Arial"/>
-                <w:color w:val="FF0000"/>
-                <w:sz w:val="20"/>
-                <w:szCs w:val="20"/>
-              </w:rPr>
-              <w:t/>
-            </w:r>
           </w:p>
         </w:tc>
         <w:tc>
@@ -497,7 +469,6 @@
             <w:r>
               <w:rPr>
                 <w:rFonts w:ascii="Segoe UI Symbol" w:hAnsi="Segoe UI Symbol" w:cs="Segoe UI Symbol"/>
-                <w:color w:val="FF0000"/>
                 <w:sz w:val="20"/>
                 <w:szCs w:val="20"/>
               </w:rPr>
@@ -603,16 +574,7 @@
                 <w:sz w:val="20"/>
                 <w:szCs w:val="20"/>
               </w:rPr>
-              <w:t xml:space="preserve"> </w:t>
-            </w:r>
-            <w:r>
-              <w:rPr>
-                <w:rFonts w:ascii="Arial" w:hAnsi="Arial" w:cs="Arial"/>
-                <w:color w:val="FF0000"/>
-                <w:sz w:val="20"/>
-                <w:szCs w:val="20"/>
-              </w:rPr>
-              <w:t>${height}</w:t>
+              <w:t xml:space="preserve">${height}</w:t>
             </w:r>
           </w:p>
         </w:tc>
@@ -652,16 +614,7 @@
                 <w:sz w:val="20"/>
                 <w:szCs w:val="20"/>
               </w:rPr>
-              <w:t xml:space="preserve"> </w:t>
-            </w:r>
-            <w:r>
-              <w:rPr>
-                <w:rFonts w:ascii="Arial" w:hAnsi="Arial" w:cs="Arial"/>
-                <w:color w:val="FF0000"/>
-                <w:sz w:val="20"/>
-                <w:szCs w:val="20"/>
-              </w:rPr>
-              <w:t>${weight}</w:t>
+              <w:t xml:space="preserve">${weight}</w:t>
             </w:r>
           </w:p>
         </w:tc>
@@ -692,16 +645,7 @@
                 <w:sz w:val="20"/>
                 <w:szCs w:val="20"/>
               </w:rPr>
-              <w:t xml:space="preserve"> </w:t>
-            </w:r>
-            <w:r>
-              <w:rPr>
-                <w:rFonts w:ascii="Arial" w:hAnsi="Arial" w:cs="Arial"/>
-                <w:color w:val="FF0000"/>
-                <w:sz w:val="20"/>
-                <w:szCs w:val="20"/>
-              </w:rPr>
-              <w:t>${complexion}</w:t>
+              <w:t xml:space="preserve">${complexion}</w:t>
             </w:r>
           </w:p>
         </w:tc>
@@ -767,21 +711,11 @@
                 <w:sz w:val="20"/>
                 <w:szCs w:val="20"/>
               </w:rPr>
-              <w:t xml:space="preserve"> </w:t>
-            </w:r>
-            <w:r>
-              <w:rPr>
-                <w:rFonts w:ascii="Arial" w:hAnsi="Arial" w:cs="Arial"/>
-                <w:color w:val="FF0000"/>
-                <w:sz w:val="20"/>
-                <w:szCs w:val="20"/>
-              </w:rPr>
-              <w:t>${birthdate}</w:t>
-            </w:r>
-            <w:r>
-              <w:rPr>
-                <w:rFonts w:ascii="Arial" w:hAnsi="Arial" w:cs="Arial"/>
-                <w:color w:val="FF0000"/>
+              <w:t xml:space="preserve">${birthdate}</w:t>
+            </w:r>
+            <w:r>
+              <w:rPr>
+                <w:rFonts w:ascii="Arial" w:hAnsi="Arial" w:cs="Arial"/>
                 <w:sz w:val="20"/>
                 <w:szCs w:val="20"/>
               </w:rPr>
@@ -814,15 +748,6 @@
             <w:r>
               <w:rPr>
                 <w:rFonts w:ascii="Arial" w:hAnsi="Arial" w:cs="Arial"/>
-                <w:sz w:val="20"/>
-                <w:szCs w:val="20"/>
-              </w:rPr>
-              <w:t xml:space="preserve"/>
-            </w:r>
-            <w:r>
-              <w:rPr>
-                <w:rFonts w:ascii="Arial" w:hAnsi="Arial" w:cs="Arial"/>
-                <w:color w:val="FF0000"/>
                 <w:sz w:val="20"/>
                 <w:szCs w:val="20"/>
               </w:rPr>
@@ -863,16 +788,7 @@
                 <w:sz w:val="20"/>
                 <w:szCs w:val="20"/>
               </w:rPr>
-              <w:t xml:space="preserve"> </w:t>
-            </w:r>
-            <w:r>
-              <w:rPr>
-                <w:rFonts w:ascii="Arial" w:hAnsi="Arial" w:cs="Arial"/>
-                <w:color w:val="FF0000"/>
-                <w:sz w:val="20"/>
-                <w:szCs w:val="20"/>
-              </w:rPr>
-              <w:t>${citizenship}</w:t>
+              <w:t xml:space="preserve">${citizenship}</w:t>
             </w:r>
           </w:p>
         </w:tc>
@@ -904,16 +820,7 @@
                 <w:sz w:val="20"/>
                 <w:szCs w:val="20"/>
               </w:rPr>
-              <w:t xml:space="preserve"> </w:t>
-            </w:r>
-            <w:r>
-              <w:rPr>
-                <w:rFonts w:ascii="Arial" w:hAnsi="Arial" w:cs="Arial"/>
-                <w:color w:val="FF0000"/>
-                <w:sz w:val="20"/>
-                <w:szCs w:val="20"/>
-              </w:rPr>
-              <w:t>${civil_status}</w:t>
+              <w:t xml:space="preserve">${civil_status}</w:t>
             </w:r>
           </w:p>
         </w:tc>
@@ -956,7 +863,6 @@
             <w:r>
               <w:rPr>
                 <w:rFonts w:ascii="Arial" w:hAnsi="Arial" w:cs="Arial"/>
-                <w:color w:val="FF0000"/>
                 <w:sz w:val="20"/>
                 <w:szCs w:val="20"/>
               </w:rPr>
@@ -966,7 +872,6 @@
             <w:r>
               <w:rPr>
                 <w:rFonts w:ascii="Arial" w:hAnsi="Arial" w:cs="Arial"/>
-                <w:color w:val="FF0000"/>
                 <w:sz w:val="20"/>
                 <w:szCs w:val="20"/>
               </w:rPr>
@@ -1002,16 +907,7 @@
                 <w:sz w:val="20"/>
                 <w:szCs w:val="20"/>
               </w:rPr>
-              <w:t xml:space="preserve"> </w:t>
-            </w:r>
-            <w:r>
-              <w:rPr>
-                <w:rFonts w:ascii="Arial" w:hAnsi="Arial" w:cs="Arial"/>
-                <w:color w:val="FF0000"/>
-                <w:sz w:val="20"/>
-                <w:szCs w:val="20"/>
-              </w:rPr>
-              <w:t>${present_contact}</w:t>
+              <w:t xml:space="preserve">${present_contact}</w:t>
             </w:r>
           </w:p>
         </w:tc>
@@ -1054,7 +950,6 @@
             <w:r>
               <w:rPr>
                 <w:rFonts w:ascii="Arial" w:hAnsi="Arial" w:cs="Arial"/>
-                <w:color w:val="FF0000"/>
                 <w:sz w:val="20"/>
                 <w:szCs w:val="20"/>
               </w:rPr>
@@ -1064,7 +959,6 @@
             <w:r>
               <w:rPr>
                 <w:rFonts w:ascii="Arial" w:hAnsi="Arial" w:cs="Arial"/>
-                <w:color w:val="FF0000"/>
                 <w:sz w:val="20"/>
                 <w:szCs w:val="20"/>
               </w:rPr>
@@ -1100,16 +994,7 @@
                 <w:sz w:val="20"/>
                 <w:szCs w:val="20"/>
               </w:rPr>
-              <w:t xml:space="preserve"> </w:t>
-            </w:r>
-            <w:r>
-              <w:rPr>
-                <w:rFonts w:ascii="Arial" w:hAnsi="Arial" w:cs="Arial"/>
-                <w:color w:val="FF0000"/>
-                <w:sz w:val="20"/>
-                <w:szCs w:val="20"/>
-              </w:rPr>
-              <w:t>${permanent_contact}</w:t>
+              <w:t xml:space="preserve">${permanent_contact}</w:t>
             </w:r>
           </w:p>
         </w:tc>
@@ -1202,7 +1087,6 @@
             <w:r>
               <w:rPr>
                 <w:rFonts w:ascii="Arial" w:hAnsi="Arial" w:cs="Arial"/>
-                <w:color w:val="FF0000"/>
                 <w:sz w:val="20"/>
                 <w:szCs w:val="20"/>
               </w:rPr>
@@ -1212,7 +1096,6 @@
             <w:r>
               <w:rPr>
                 <w:rFonts w:ascii="Arial" w:hAnsi="Arial" w:cs="Arial"/>
-                <w:color w:val="FF0000"/>
                 <w:sz w:val="20"/>
                 <w:szCs w:val="20"/>
               </w:rPr>
@@ -1285,22 +1168,12 @@
                 <w:sz w:val="20"/>
                 <w:szCs w:val="20"/>
               </w:rPr>
-              <w:t xml:space="preserve"> </w:t>
-            </w:r>
-            <w:r>
-              <w:rPr>
-                <w:rFonts w:ascii="Arial" w:hAnsi="Arial" w:cs="Arial"/>
-                <w:color w:val="FF0000"/>
-                <w:sz w:val="20"/>
-                <w:szCs w:val="20"/>
-              </w:rPr>
               <w:t xml:space="preserve">${mother_name}</w:t>
             </w:r>
             <w:proofErr w:type="spellStart"/>
             <w:r>
               <w:rPr>
                 <w:rFonts w:ascii="Arial" w:hAnsi="Arial" w:cs="Arial"/>
-                <w:color w:val="FF0000"/>
                 <w:sz w:val="20"/>
                 <w:szCs w:val="20"/>
               </w:rPr>
@@ -1310,7 +1183,6 @@
             <w:r>
               <w:rPr>
                 <w:rFonts w:ascii="Arial" w:hAnsi="Arial" w:cs="Arial"/>
-                <w:color w:val="FF0000"/>
                 <w:sz w:val="20"/>
                 <w:szCs w:val="20"/>
               </w:rPr>
@@ -1320,7 +1192,6 @@
             <w:r>
               <w:rPr>
                 <w:rFonts w:ascii="Arial" w:hAnsi="Arial" w:cs="Arial"/>
-                <w:color w:val="FF0000"/>
                 <w:sz w:val="20"/>
                 <w:szCs w:val="20"/>
               </w:rPr>
@@ -1410,7 +1281,6 @@
             <w:r>
               <w:rPr>
                 <w:rFonts w:ascii="Arial" w:hAnsi="Arial" w:cs="Arial"/>
-                <w:color w:val="FF0000"/>
                 <w:kern w:val="0"/>
                 <w:sz w:val="20"/>
                 <w:szCs w:val="20"/>
@@ -1422,7 +1292,6 @@
             <w:r>
               <w:rPr>
                 <w:rFonts w:ascii="Arial" w:hAnsi="Arial" w:cs="Arial"/>
-                <w:color w:val="FF0000"/>
                 <w:kern w:val="0"/>
                 <w:sz w:val="20"/>
                 <w:szCs w:val="20"/>
@@ -1460,21 +1329,11 @@
                 <w:sz w:val="20"/>
                 <w:szCs w:val="20"/>
               </w:rPr>
-              <w:t xml:space="preserve"> </w:t>
-            </w:r>
-            <w:r>
-              <w:rPr>
-                <w:rFonts w:ascii="Arial" w:hAnsi="Arial" w:cs="Arial"/>
-                <w:color w:val="FF0000"/>
-                <w:sz w:val="20"/>
-                <w:szCs w:val="20"/>
-              </w:rPr>
-              <w:t>${parents_contact}</w:t>
-            </w:r>
-            <w:r>
-              <w:rPr>
-                <w:rFonts w:ascii="Arial" w:hAnsi="Arial" w:cs="Arial"/>
-                <w:color w:val="FF0000"/>
+              <w:t xml:space="preserve">${parents_contact}</w:t>
+            </w:r>
+            <w:r>
+              <w:rPr>
+                <w:rFonts w:ascii="Arial" w:hAnsi="Arial" w:cs="Arial"/>
                 <w:sz w:val="20"/>
                 <w:szCs w:val="20"/>
               </w:rPr>
@@ -1483,7 +1342,6 @@
             <w:r>
               <w:rPr>
                 <w:rFonts w:ascii="Arial" w:hAnsi="Arial" w:cs="Arial"/>
-                <w:color w:val="FF0000"/>
                 <w:sz w:val="20"/>
                 <w:szCs w:val="20"/>
               </w:rPr>
@@ -1524,22 +1382,12 @@
                 <w:sz w:val="20"/>
                 <w:szCs w:val="20"/>
               </w:rPr>
-              <w:t xml:space="preserve"> </w:t>
-            </w:r>
-            <w:r>
-              <w:rPr>
-                <w:rFonts w:ascii="Arial" w:hAnsi="Arial" w:cs="Arial"/>
-                <w:color w:val="FF0000"/>
-                <w:sz w:val="20"/>
-                <w:szCs w:val="20"/>
-              </w:rPr>
               <w:t xml:space="preserve">${guardian_name}</w:t>
             </w:r>
             <w:proofErr w:type="spellStart"/>
             <w:r>
               <w:rPr>
                 <w:rFonts w:ascii="Arial" w:hAnsi="Arial" w:cs="Arial"/>
-                <w:color w:val="FF0000"/>
                 <w:sz w:val="20"/>
                 <w:szCs w:val="20"/>
               </w:rPr>
@@ -1549,7 +1397,6 @@
             <w:r>
               <w:rPr>
                 <w:rFonts w:ascii="Arial" w:hAnsi="Arial" w:cs="Arial"/>
-                <w:color w:val="FF0000"/>
                 <w:sz w:val="20"/>
                 <w:szCs w:val="20"/>
               </w:rPr>
@@ -1559,7 +1406,6 @@
             <w:r>
               <w:rPr>
                 <w:rFonts w:ascii="Arial" w:hAnsi="Arial" w:cs="Arial"/>
-                <w:color w:val="FF0000"/>
                 <w:sz w:val="20"/>
                 <w:szCs w:val="20"/>
               </w:rPr>
@@ -1596,16 +1442,7 @@
                 <w:sz w:val="20"/>
                 <w:szCs w:val="20"/>
               </w:rPr>
-              <w:t xml:space="preserve"> </w:t>
-            </w:r>
-            <w:r>
-              <w:rPr>
-                <w:rFonts w:ascii="Arial" w:hAnsi="Arial" w:cs="Arial"/>
-                <w:color w:val="FF0000"/>
-                <w:sz w:val="20"/>
-                <w:szCs w:val="20"/>
-              </w:rPr>
-              <w:t>${guardian_contact}</w:t>
+              <w:t xml:space="preserve">${guardian_contact}</w:t>
             </w:r>
           </w:p>
         </w:tc>
@@ -1676,16 +1513,15 @@
                 <w:sz w:val="20"/>
                 <w:szCs w:val="20"/>
               </w:rPr>
-              <w:t xml:space="preserve"> </w:t>
-            </w:r>
-            <w:r>
-              <w:rPr>
-                <w:rFonts w:ascii="Arial" w:hAnsi="Arial" w:cs="Arial"/>
-                <w:color w:val="FF0000"/>
-                <w:sz w:val="20"/>
-                <w:szCs w:val="20"/>
-              </w:rPr>
-              <w:t>${course_name}</w:t>
+              <w:t xml:space="preserve">${course_name}</w:t>
+            </w:r>
+            <w:r>
+              <w:rPr>
+                <w:rFonts w:ascii="Arial" w:hAnsi="Arial" w:cs="Arial"/>
+                <w:sz w:val="20"/>
+                <w:szCs w:val="20"/>
+              </w:rPr>
+              <w:t/>
             </w:r>
           </w:p>
         </w:tc>
@@ -1717,16 +1553,7 @@
                 <w:sz w:val="20"/>
                 <w:szCs w:val="20"/>
               </w:rPr>
-              <w:t xml:space="preserve"> </w:t>
-            </w:r>
-            <w:r>
-              <w:rPr>
-                <w:rFonts w:ascii="Arial" w:hAnsi="Arial" w:cs="Arial"/>
-                <w:color w:val="FF0000"/>
-                <w:sz w:val="20"/>
-                <w:szCs w:val="20"/>
-              </w:rPr>
-              <w:t>${year_level_word} Year</w:t>
+              <w:t xml:space="preserve">${year_level_word} Year</w:t>
             </w:r>
           </w:p>
         </w:tc>
@@ -1768,7 +1595,6 @@
             <w:r>
               <w:rPr>
                 <w:rFonts w:ascii="Arial" w:hAnsi="Arial" w:cs="Arial"/>
-                <w:color w:val="FF0000"/>
                 <w:sz w:val="20"/>
                 <w:szCs w:val="20"/>
               </w:rPr>
@@ -1804,12 +1630,11 @@
                 <w:sz w:val="20"/>
                 <w:szCs w:val="20"/>
               </w:rPr>
-              <w:t xml:space="preserve"> </w:t>
-            </w:r>
-            <w:r>
-              <w:rPr>
-                <w:rFonts w:ascii="Arial" w:hAnsi="Arial" w:cs="Arial"/>
-                <w:color w:val="FF0000"/>
+              <w:t xml:space="preserve"/>
+            </w:r>
+            <w:r>
+              <w:rPr>
+                <w:rFonts w:ascii="Arial" w:hAnsi="Arial" w:cs="Arial"/>
                 <w:sz w:val="20"/>
                 <w:szCs w:val="20"/>
               </w:rPr>
@@ -1924,7 +1749,6 @@
             <w:r>
               <w:rPr>
                 <w:rFonts w:ascii="Arial" w:hAnsi="Arial" w:cs="Arial"/>
-                <w:color w:val="FF0000"/>
                 <w:sz w:val="20"/>
                 <w:szCs w:val="20"/>
               </w:rPr>
@@ -1933,7 +1757,6 @@
             <w:r>
               <w:rPr>
                 <w:rFonts w:ascii="Arial" w:hAnsi="Arial" w:cs="Arial"/>
-                <w:color w:val="FF0000"/>
                 <w:sz w:val="20"/>
                 <w:szCs w:val="20"/>
               </w:rPr>
@@ -1975,7 +1798,6 @@
               <w:rPr>
                 <w:rStyle w:val="x3jgonx"/>
                 <w:rFonts w:ascii="Arial" w:hAnsi="Arial" w:cs="Arial"/>
-                <w:color w:val="FF0000"/>
                 <w:sz w:val="20"/>
                 <w:szCs w:val="20"/>
               </w:rPr>
@@ -2045,22 +1867,12 @@
                 <w:sz w:val="20"/>
                 <w:szCs w:val="20"/>
               </w:rPr>
-              <w:t xml:space="preserve"> </w:t>
-            </w:r>
-            <w:r>
-              <w:rPr>
-                <w:rFonts w:ascii="Arial" w:hAnsi="Arial" w:cs="Arial"/>
-                <w:color w:val="FF0000"/>
-                <w:sz w:val="20"/>
-                <w:szCs w:val="20"/>
-              </w:rPr>
-              <w:t xml:space="preserve">${guardian_name}</w:t>
+              <w:t xml:space="preserve">${emergency_name}</w:t>
             </w:r>
             <w:proofErr w:type="spellStart"/>
             <w:r>
               <w:rPr>
                 <w:rFonts w:ascii="Arial" w:hAnsi="Arial" w:cs="Arial"/>
-                <w:color w:val="FF0000"/>
                 <w:sz w:val="20"/>
                 <w:szCs w:val="20"/>
               </w:rPr>
@@ -2070,7 +1882,6 @@
             <w:r>
               <w:rPr>
                 <w:rFonts w:ascii="Arial" w:hAnsi="Arial" w:cs="Arial"/>
-                <w:color w:val="FF0000"/>
                 <w:sz w:val="20"/>
                 <w:szCs w:val="20"/>
               </w:rPr>
@@ -2080,7 +1891,6 @@
             <w:r>
               <w:rPr>
                 <w:rFonts w:ascii="Arial" w:hAnsi="Arial" w:cs="Arial"/>
-                <w:color w:val="FF0000"/>
                 <w:sz w:val="20"/>
                 <w:szCs w:val="20"/>
               </w:rPr>
@@ -2117,16 +1927,7 @@
                 <w:sz w:val="20"/>
                 <w:szCs w:val="20"/>
               </w:rPr>
-              <w:t xml:space="preserve"> </w:t>
-            </w:r>
-            <w:r>
-              <w:rPr>
-                <w:rFonts w:ascii="Arial" w:hAnsi="Arial" w:cs="Arial"/>
-                <w:color w:val="FF0000"/>
-                <w:sz w:val="20"/>
-                <w:szCs w:val="20"/>
-              </w:rPr>
-              <w:t/>
+              <w:t xml:space="preserve">${emergency_relationship}</w:t>
             </w:r>
           </w:p>
         </w:tc>
@@ -2169,19 +1970,17 @@
             <w:r>
               <w:rPr>
                 <w:rFonts w:ascii="Arial" w:hAnsi="Arial" w:cs="Arial"/>
-                <w:color w:val="FF0000"/>
                 <w:kern w:val="0"/>
                 <w:sz w:val="20"/>
                 <w:szCs w:val="20"/>
                 <w14:ligatures w14:val="none"/>
               </w:rPr>
-              <w:t>${parents_address}</w:t>
+              <w:t>${emergency_address}</w:t>
             </w:r>
             <w:proofErr w:type="spellEnd"/>
             <w:r>
               <w:rPr>
                 <w:rFonts w:ascii="Arial" w:hAnsi="Arial" w:cs="Arial"/>
-                <w:color w:val="FF0000"/>
                 <w:kern w:val="0"/>
                 <w:sz w:val="20"/>
                 <w:szCs w:val="20"/>
@@ -2219,16 +2018,7 @@
                 <w:sz w:val="20"/>
                 <w:szCs w:val="20"/>
               </w:rPr>
-              <w:t xml:space="preserve"> </w:t>
-            </w:r>
-            <w:r>
-              <w:rPr>
-                <w:rFonts w:ascii="Arial" w:hAnsi="Arial" w:cs="Arial"/>
-                <w:color w:val="FF0000"/>
-                <w:sz w:val="20"/>
-                <w:szCs w:val="20"/>
-              </w:rPr>
-              <w:t>${parents_contact}</w:t>
+              <w:t xml:space="preserve">${emergency_contact}</w:t>
             </w:r>
           </w:p>
         </w:tc>
@@ -2328,15 +2118,43 @@
         <w:jc w:val="center"/>
         <w:rPr>
           <w:rFonts w:ascii="Arial" w:hAnsi="Arial" w:cs="Arial"/>
-          <w:color w:val="FF0000"/>
         </w:rPr>
       </w:pPr>
       <w:r>
         <w:rPr>
           <w:rFonts w:ascii="Arial" w:hAnsi="Arial" w:cs="Arial"/>
-          <w:color w:val="FF0000"/>
         </w:rPr>
-        <w:t>${intern_name}</w:t>
+        <w:t>_</w:t>
+      </w:r>
+      <w:r>
+        <w:rPr>
+          <w:rFonts w:ascii="Arial" w:hAnsi="Arial" w:cs="Arial"/>
+        </w:rPr>
+        <w:t>__________________</w:t>
+      </w:r>
+      <w:r>
+        <w:rPr>
+          <w:rFonts w:ascii="Arial" w:hAnsi="Arial" w:cs="Arial"/>
+        </w:rPr>
+        <w:t>_</w:t>
+      </w:r>
+      <w:r>
+        <w:rPr>
+          <w:rFonts w:ascii="Arial" w:hAnsi="Arial" w:cs="Arial"/>
+        </w:rPr>
+        <w:t>________</w:t>
+      </w:r>
+      <w:r>
+        <w:rPr>
+          <w:rFonts w:ascii="Arial" w:hAnsi="Arial" w:cs="Arial"/>
+        </w:rPr>
+        <w:t>_</w:t>
+      </w:r>
+      <w:r>
+        <w:rPr>
+          <w:rFonts w:ascii="Arial" w:hAnsi="Arial" w:cs="Arial"/>
+        </w:rPr>
+        <w:t>________</w:t>
       </w:r>
     </w:p>
     <w:p>

</xml_diff>